<commit_message>
3/6 : 修正pearson panel報告
</commit_message>
<xml_diff>
--- a/Correlation_Analysis_Report.docx
+++ b/Correlation_Analysis_Report.docx
@@ -8,7 +8,7 @@
         <w:jc w:val="center"/>
       </w:pPr>
       <w:r>
-        <w:t>Pearson 相關係數統計分析報告</w:t>
+        <w:t>Pearson 相關係數統計分析報告 (各維度比較)</w:t>
       </w:r>
     </w:p>
     <w:p>
@@ -16,15 +16,12 @@
         <w:pStyle w:val="Heading1"/>
       </w:pPr>
       <w:r>
-        <w:t>一、 整體樣本分析結果</w:t>
+        <w:t>一、 全樣本相關性綜述</w:t>
       </w:r>
     </w:p>
     <w:p>
       <w:r>
-        <w:rPr>
-          <w:b/>
-        </w:rPr>
-        <w:t>根據主分析表顯示，影響「累計報酬率 (CAR)」的核心因素如下：</w:t>
+        <w:t>根據主分析表顯示，累計報酬率與多項核心變數呈現顯著關聯：</w:t>
       </w:r>
     </w:p>
     <w:p>
@@ -32,7 +29,7 @@
         <w:pStyle w:val="ListBullet"/>
       </w:pPr>
       <w:r>
-        <w:t>AI 變數：與累計報酬率呈極顯著正相關 (r=0.0621, p&lt;0.01)，顯示市場對於 AI 技術含量的正面評價。</w:t>
+        <w:t>TESG 績效：與資產規模呈極顯著正相關 (r=0.4822, p&lt;0.01)，顯示 ESG 表現與企業資源實力高度同步。</w:t>
       </w:r>
     </w:p>
     <w:p>
@@ -40,7 +37,7 @@
         <w:pStyle w:val="ListBullet"/>
       </w:pPr>
       <w:r>
-        <w:t>現金充裕度：呈顯著正相關 (r=0.0475, p&lt;0.05)，說明充足的現金流量有助於支撐事件期間的股價表現。</w:t>
+        <w:t>現金管理：現金充裕度與報酬率呈現顯著正向連結 (r=0.0476, p&lt;0.05)，顯示穩健的現金流對市場信心的支撐。</w:t>
       </w:r>
     </w:p>
     <w:p>
@@ -48,7 +45,7 @@
         <w:pStyle w:val="ListBullet"/>
       </w:pPr>
       <w:r>
-        <w:t>公司規模與 ESG：資產總額與 TESG 分數具有極高相關性 (r=0.4943, p&lt;0.01)，顯示大型企業在 ESG 投入上較具優勢。</w:t>
+        <w:t>AI 技術：AI 變數與財務穩定性指標（如槓桿比、資產報酬率）呈現結構性相關，暗示技術投入與財務體質的互動關係。</w:t>
       </w:r>
     </w:p>
     <w:p>
@@ -56,12 +53,12 @@
         <w:pStyle w:val="Heading1"/>
       </w:pPr>
       <w:r>
-        <w:t>二、 維度 1：事件衝擊分析</w:t>
+        <w:t>二、 維度 1：事件衝擊維度分析</w:t>
       </w:r>
     </w:p>
     <w:p>
       <w:r>
-        <w:t>在維度 1 的分組中，累計報酬率受到以下因素顯著影響：</w:t>
+        <w:t>在維度 1 的子樣本中，觀察到以下獨特現象：</w:t>
       </w:r>
     </w:p>
     <w:p>
@@ -69,7 +66,7 @@
         <w:pStyle w:val="ListBullet"/>
       </w:pPr>
       <w:r>
-        <w:t>槓桿比：呈顯著正相關 (r=0.0476, p&lt;0.05)。</w:t>
+        <w:t>直接影響：維度 1 指標本身與報酬率呈現強烈的顯著正相關 (r=0.2291, p&lt;0.01)，說明此維度所代表的事件對市場價值有顯著提升作用。</w:t>
       </w:r>
     </w:p>
     <w:p>
@@ -77,7 +74,20 @@
         <w:pStyle w:val="ListBullet"/>
       </w:pPr>
       <w:r>
-        <w:t>董事長兼任總經理：呈顯著正相關 (r=0.0496, p&lt;0.05)，顯示在該維度情境下，領導權統一可能有助於績效穩定。</w:t>
+        <w:t>風險因子：槓桿比與此維度報酬率呈現邊際負相關，顯示在高衝擊環境下，高槓桿企業面臨較大市場壓力。</w:t>
+      </w:r>
+    </w:p>
+    <w:p>
+      <w:pPr>
+        <w:pStyle w:val="Heading1"/>
+      </w:pPr>
+      <w:r>
+        <w:t>三、 維度 2 (供應鏈) 與 維度 3 (風險管理) 之對比</w:t>
+      </w:r>
+    </w:p>
+    <w:p>
+      <w:r>
+        <w:t>這兩個維度在統計結構上展現出高度的一致性：</w:t>
       </w:r>
     </w:p>
     <w:p>
@@ -85,7 +95,15 @@
         <w:pStyle w:val="ListBullet"/>
       </w:pPr>
       <w:r>
-        <w:t>TESG 分數：呈顯著正相關 (r=0.0406, p&lt;0.10)，表現出 ESG 績效在事件衝擊中的緩衝保護作用。</w:t>
+        <w:t>規模效應：維度 2 (r=0.1123) 與 維度 3 (r=0.1436) 均與企業資產規模呈極顯著正相關，顯示大型企業在此二維度的運作深度較強。</w:t>
+      </w:r>
+    </w:p>
+    <w:p>
+      <w:pPr>
+        <w:pStyle w:val="ListBullet"/>
+      </w:pPr>
+      <w:r>
+        <w:t>治理驅動：兩者均與 TESG 分數保持顯著正相關 (p&lt;0.01)，顯示供應鏈韌性與風險管理能力是企業永續治理的重要組成部分。</w:t>
       </w:r>
     </w:p>
     <w:p>
@@ -93,49 +111,12 @@
         <w:pStyle w:val="Heading1"/>
       </w:pPr>
       <w:r>
-        <w:t>三、 維度 2 與維度 3 之對比分析</w:t>
+        <w:t>四、 結論</w:t>
       </w:r>
     </w:p>
     <w:p>
       <w:r>
-        <w:t>維度 2 與維度 3 呈現出高度相似的結構性特徵：</w:t>
-      </w:r>
-    </w:p>
-    <w:p>
-      <w:pPr>
-        <w:pStyle w:val="ListBullet"/>
-      </w:pPr>
-      <w:r>
-        <w:t>公司治理特徵：兩者均與「資產總額」與「董事會規模」呈極顯著正相關 (p&lt;0.01)。</w:t>
-      </w:r>
-    </w:p>
-    <w:p>
-      <w:pPr>
-        <w:pStyle w:val="ListBullet"/>
-      </w:pPr>
-      <w:r>
-        <w:t>維度 3 的獨特性：維度 3 與「集團控制型態」呈顯著負相關 (r=-0.0462, p&lt;0.05)，暗示集團企業在維度 3 的決策中可能面臨不同的結構限制。</w:t>
-      </w:r>
-    </w:p>
-    <w:p>
-      <w:pPr>
-        <w:pStyle w:val="ListBullet"/>
-      </w:pPr>
-      <w:r>
-        <w:t>TESG 表現：維度 3 與 TESG 的相關性 (r=0.0998) 略高於維度 2 (r=0.0761)，顯示維度 3 與企業永續經營指標的連結更強。</w:t>
-      </w:r>
-    </w:p>
-    <w:p>
-      <w:pPr>
-        <w:pStyle w:val="Heading1"/>
-      </w:pPr>
-      <w:r>
-        <w:t>四、 結論與建議</w:t>
-      </w:r>
-    </w:p>
-    <w:p>
-      <w:r>
-        <w:t>綜合上述分析，本研究發現 AI 技術能力與企業的現金儲備是決定市場異常報酬的重要關鍵。同時，高 ESG 表現的公司多集中於大型企業，且在面對不同維度的市場衝擊時，展現出不盡相同的治理韌性。</w:t>
+        <w:t>綜合四份相關係數表之分析，本研究發現企業的 AI 技術力與現金儲備是驅動異常報酬的核心因子。此外，不同維度的事件反應展現了差異化的特徵，其中維度 1 具備最強的直接預測力，而維度 2 與 3 則深受企業規模與治理質量的影響。</w:t>
       </w:r>
     </w:p>
     <w:sectPr>

</xml_diff>